<commit_message>
Revisi Production and Mobile Optimation
</commit_message>
<xml_diff>
--- a/BAB_III_VPS.docx
+++ b/BAB_III_VPS.docx
@@ -4238,6 +4238,383 @@
           <w:sz w:val="20"/>
         </w:rPr>
         <w:t>Gambar 3.26 Dashboard Moneygement Setelah Login di Production</w:t>
+      </w:r>
+    </w:p>
+    <w:p>
+      <w:pPr>
+        <w:pStyle w:val="Heading1"/>
+      </w:pPr>
+      <w:r>
+        <w:t>Konfigurasi HTTPS (SSL) dengan Certbot</w:t>
+      </w:r>
+    </w:p>
+    <w:p>
+      <w:pPr>
+        <w:ind w:firstLine="720"/>
+      </w:pPr>
+      <w:r>
+        <w:t>Untuk mengamankan transaksi data pengguna, aplikasi perlu menggunakan protokol HTTPS. Kita akan menggunakan Let's Encrypt dan Certbot untuk mendapatkan sertifikat SSL gratis secara otomatis.</w:t>
+      </w:r>
+    </w:p>
+    <w:p>
+      <w:pPr>
+        <w:ind w:firstLine="720"/>
+      </w:pPr>
+      <w:r>
+        <w:t>Syarat utama: Anda harus memiliki domain (contoh: moneygement.my.id) yang sudah diarahkan ke IP Server (34.124.226.208).</w:t>
+      </w:r>
+    </w:p>
+    <w:p>
+      <w:r>
+        <w:t>Instalasi Certbot</w:t>
+      </w:r>
+    </w:p>
+    <w:p>
+      <w:pPr>
+        <w:pStyle w:val="Heading2"/>
+      </w:pPr>
+      <w:r>
+        <w:t>Instal paket Certbot dan plugin Nginx.</w:t>
+      </w:r>
+    </w:p>
+    <w:p>
+      <w:r>
+        <w:rPr>
+          <w:b/>
+          <w:sz w:val="22"/>
+        </w:rPr>
+        <w:t>Tabel 3.33 Command Instalasi Certbot</w:t>
+      </w:r>
+    </w:p>
+    <w:tbl>
+      <w:tblPr>
+        <w:tblStyle w:val="TableGrid"/>
+        <w:tblW w:type="auto" w:w="0"/>
+        <w:jc w:val="center"/>
+        <w:tblLook w:firstColumn="1" w:firstRow="1" w:lastColumn="0" w:lastRow="0" w:noHBand="0" w:noVBand="1" w:val="04A0"/>
+      </w:tblPr>
+      <w:tblGrid>
+        <w:gridCol w:w="9360"/>
+      </w:tblGrid>
+      <w:tr>
+        <w:tc>
+          <w:tcPr>
+            <w:tcW w:type="dxa" w:w="8640"/>
+            <w:shd w:fill="F5F5F5"/>
+          </w:tcPr>
+          <w:p>
+            <w:r>
+              <w:rPr>
+                <w:rFonts w:ascii="Consolas" w:hAnsi="Consolas"/>
+                <w:sz w:val="18"/>
+              </w:rPr>
+              <w:t>$ sudo apt update</w:t>
+            </w:r>
+            <w:r>
+              <w:br/>
+            </w:r>
+            <w:r>
+              <w:rPr>
+                <w:rFonts w:ascii="Consolas" w:hAnsi="Consolas"/>
+                <w:sz w:val="18"/>
+              </w:rPr>
+              <w:t>$ sudo apt install certbot python3-certbot-nginx -y</w:t>
+            </w:r>
+            <w:r>
+              <w:br/>
+            </w:r>
+            <w:r>
+              <w:rPr>
+                <w:rFonts w:ascii="Consolas" w:hAnsi="Consolas"/>
+                <w:sz w:val="18"/>
+              </w:rPr>
+              <w:t>Output:</w:t>
+            </w:r>
+            <w:r>
+              <w:br/>
+            </w:r>
+            <w:r>
+              <w:rPr>
+                <w:rFonts w:ascii="Consolas" w:hAnsi="Consolas"/>
+                <w:sz w:val="18"/>
+              </w:rPr>
+              <w:t>Reading package lists... Done</w:t>
+            </w:r>
+            <w:r>
+              <w:br/>
+            </w:r>
+            <w:r>
+              <w:rPr>
+                <w:rFonts w:ascii="Consolas" w:hAnsi="Consolas"/>
+                <w:sz w:val="18"/>
+              </w:rPr>
+              <w:t>Setting up certbot (2.9.0-1ubuntu0.1) ...</w:t>
+            </w:r>
+          </w:p>
+        </w:tc>
+      </w:tr>
+    </w:tbl>
+    <w:p/>
+    <w:p>
+      <w:pPr>
+        <w:jc w:val="center"/>
+      </w:pPr>
+      <w:r>
+        <w:rPr>
+          <w:i/>
+          <w:sz w:val="20"/>
+        </w:rPr>
+        <w:t>Gambar 3.27 Output Instalasi Certbot</w:t>
+      </w:r>
+    </w:p>
+    <w:p>
+      <w:r>
+        <w:t>Request Sertifikat SSL</w:t>
+      </w:r>
+    </w:p>
+    <w:p>
+      <w:r>
+        <w:t>Jalankan Certbot untuk meminta sertifikat dan mengkonfigurasi Nginx secara otomatis. Ganti `yourdomain.com` dengan nama domain Anda yang sebenarnya.</w:t>
+      </w:r>
+    </w:p>
+    <w:p>
+      <w:r>
+        <w:rPr>
+          <w:b/>
+          <w:sz w:val="22"/>
+        </w:rPr>
+        <w:t>Tabel 3.34 Command Request SSL</w:t>
+      </w:r>
+    </w:p>
+    <w:tbl>
+      <w:tblPr>
+        <w:tblStyle w:val="TableGrid"/>
+        <w:tblW w:type="auto" w:w="0"/>
+        <w:jc w:val="center"/>
+        <w:tblLook w:firstColumn="1" w:firstRow="1" w:lastColumn="0" w:lastRow="0" w:noHBand="0" w:noVBand="1" w:val="04A0"/>
+      </w:tblPr>
+      <w:tblGrid>
+        <w:gridCol w:w="9360"/>
+      </w:tblGrid>
+      <w:tr>
+        <w:tc>
+          <w:tcPr>
+            <w:tcW w:type="dxa" w:w="8640"/>
+            <w:shd w:fill="F5F5F5"/>
+          </w:tcPr>
+          <w:p>
+            <w:r>
+              <w:rPr>
+                <w:rFonts w:ascii="Consolas" w:hAnsi="Consolas"/>
+                <w:sz w:val="18"/>
+              </w:rPr>
+              <w:t>$ sudo certbot --nginx -d yourdomain.com</w:t>
+            </w:r>
+            <w:r>
+              <w:br/>
+            </w:r>
+            <w:r>
+              <w:rPr>
+                <w:rFonts w:ascii="Consolas" w:hAnsi="Consolas"/>
+                <w:sz w:val="18"/>
+              </w:rPr>
+              <w:t>Interactive Prompts:</w:t>
+            </w:r>
+            <w:r>
+              <w:br/>
+            </w:r>
+            <w:r>
+              <w:rPr>
+                <w:rFonts w:ascii="Consolas" w:hAnsi="Consolas"/>
+                <w:sz w:val="18"/>
+              </w:rPr>
+              <w:t>1. Enter email address (used for urgent renewal and security notices)</w:t>
+            </w:r>
+            <w:r>
+              <w:br/>
+            </w:r>
+            <w:r>
+              <w:rPr>
+                <w:rFonts w:ascii="Consolas" w:hAnsi="Consolas"/>
+                <w:sz w:val="18"/>
+              </w:rPr>
+              <w:t>2. Agree to Terms of Service (Y)</w:t>
+            </w:r>
+            <w:r>
+              <w:br/>
+            </w:r>
+            <w:r>
+              <w:rPr>
+                <w:rFonts w:ascii="Consolas" w:hAnsi="Consolas"/>
+                <w:sz w:val="18"/>
+              </w:rPr>
+              <w:t>3. Share email with EFF (N)</w:t>
+            </w:r>
+            <w:r>
+              <w:br/>
+            </w:r>
+            <w:r>
+              <w:rPr>
+                <w:rFonts w:ascii="Consolas" w:hAnsi="Consolas"/>
+                <w:sz w:val="18"/>
+              </w:rPr>
+              <w:t>Output:</w:t>
+            </w:r>
+            <w:r>
+              <w:br/>
+            </w:r>
+            <w:r>
+              <w:rPr>
+                <w:rFonts w:ascii="Consolas" w:hAnsi="Consolas"/>
+                <w:sz w:val="18"/>
+              </w:rPr>
+              <w:t>Successfully received certificate.</w:t>
+            </w:r>
+            <w:r>
+              <w:br/>
+            </w:r>
+            <w:r>
+              <w:rPr>
+                <w:rFonts w:ascii="Consolas" w:hAnsi="Consolas"/>
+                <w:sz w:val="18"/>
+              </w:rPr>
+              <w:t>Certificate is saved at: /etc/letsencrypt/live/yourdomain.com/fullchain.pem</w:t>
+            </w:r>
+            <w:r>
+              <w:br/>
+            </w:r>
+            <w:r>
+              <w:rPr>
+                <w:rFonts w:ascii="Consolas" w:hAnsi="Consolas"/>
+                <w:sz w:val="18"/>
+              </w:rPr>
+              <w:t>Key is saved at:         /etc/letsencrypt/live/yourdomain.com/privkey.pem</w:t>
+            </w:r>
+            <w:r>
+              <w:br/>
+            </w:r>
+            <w:r>
+              <w:rPr>
+                <w:rFonts w:ascii="Consolas" w:hAnsi="Consolas"/>
+                <w:sz w:val="18"/>
+              </w:rPr>
+              <w:t>Deploying certificate to VirtualHost /etc/nginx/sites-enabled/moneygement</w:t>
+            </w:r>
+            <w:r>
+              <w:br/>
+            </w:r>
+            <w:r>
+              <w:rPr>
+                <w:rFonts w:ascii="Consolas" w:hAnsi="Consolas"/>
+                <w:sz w:val="18"/>
+              </w:rPr>
+              <w:t>Congratulations! You have successfully enabled HTTPS on https://yourdomain.com</w:t>
+            </w:r>
+          </w:p>
+        </w:tc>
+      </w:tr>
+    </w:tbl>
+    <w:p/>
+    <w:p>
+      <w:pPr>
+        <w:jc w:val="center"/>
+      </w:pPr>
+      <w:r>
+        <w:rPr>
+          <w:i/>
+          <w:sz w:val="20"/>
+        </w:rPr>
+        <w:t>Gambar 3.28 Proses Request SSL Certbot</w:t>
+      </w:r>
+    </w:p>
+    <w:p>
+      <w:r>
+        <w:t>Update Environment Variable</w:t>
+      </w:r>
+    </w:p>
+    <w:p>
+      <w:r>
+        <w:t>Ubah `APP_URL` di file `.env` agar menggunakan protokol HTTPS.</w:t>
+      </w:r>
+    </w:p>
+    <w:p>
+      <w:r>
+        <w:rPr>
+          <w:b/>
+          <w:sz w:val="22"/>
+        </w:rPr>
+        <w:t>Tabel 3.35 Command Update APP_URL</w:t>
+      </w:r>
+    </w:p>
+    <w:tbl>
+      <w:tblPr>
+        <w:tblStyle w:val="TableGrid"/>
+        <w:tblW w:type="auto" w:w="0"/>
+        <w:jc w:val="center"/>
+        <w:tblLook w:firstColumn="1" w:firstRow="1" w:lastColumn="0" w:lastRow="0" w:noHBand="0" w:noVBand="1" w:val="04A0"/>
+      </w:tblPr>
+      <w:tblGrid>
+        <w:gridCol w:w="9360"/>
+      </w:tblGrid>
+      <w:tr>
+        <w:tc>
+          <w:tcPr>
+            <w:tcW w:type="dxa" w:w="8640"/>
+            <w:shd w:fill="F5F5F5"/>
+          </w:tcPr>
+          <w:p>
+            <w:r>
+              <w:rPr>
+                <w:rFonts w:ascii="Consolas" w:hAnsi="Consolas"/>
+                <w:sz w:val="18"/>
+              </w:rPr>
+              <w:t>$ sudo nano /var/www/moneygement/.env</w:t>
+            </w:r>
+          </w:p>
+        </w:tc>
+      </w:tr>
+    </w:tbl>
+    <w:p/>
+    <w:p>
+      <w:r>
+        <w:t>Ubah baris:</w:t>
+      </w:r>
+    </w:p>
+    <w:p>
+      <w:r>
+        <w:t>`APP_URL=http://34.124.226.208`</w:t>
+      </w:r>
+    </w:p>
+    <w:p>
+      <w:r>
+        <w:t>Menjadi:</w:t>
+      </w:r>
+    </w:p>
+    <w:p>
+      <w:r>
+        <w:t>`APP_URL=https://yourdomain.com`</w:t>
+      </w:r>
+    </w:p>
+    <w:p>
+      <w:r>
+        <w:t>Verifikasi HTTPS</w:t>
+      </w:r>
+    </w:p>
+    <w:p>
+      <w:r>
+        <w:t>Buka browser dan akses domain Anda dengan `https://`. Pastikan ikon gembok muncul di samping URL.</w:t>
+      </w:r>
+    </w:p>
+    <w:p>
+      <w:pPr>
+        <w:jc w:val="center"/>
+      </w:pPr>
+      <w:r>
+        <w:rPr>
+          <w:i/>
+          <w:sz w:val="20"/>
+        </w:rPr>
+        <w:t>Gambar 3.29 Tampilan Website Aman dengan HTTPS</w:t>
       </w:r>
     </w:p>
     <w:p>

</xml_diff>